<commit_message>
docs(lab): fakültə — İT və İdarə etmə Fakültəsi
Made-with: Cursor
</commit_message>
<xml_diff>
--- a/docs/lab.docx
+++ b/docs/lab.docx
@@ -65,13 +65,7 @@
         <w:jc w:val="center"/>
       </w:pPr>
       <w:r>
-        <w:rPr>
-          <w:rFonts w:ascii="Times New Roman" w:cs="Times New Roman" w:eastAsia="Times New Roman" w:hAnsi="Times New Roman"/>
-          <w:color w:val="1F3864"/>
-          <w:sz w:val="24"/>
-          <w:szCs w:val="24"/>
-        </w:rPr>
-        <w:t xml:space="preserve">İnformasiya Texnologiyaları Fakültəsi</w:t>
+        <w:t>İT və İdarə etmə Fakültəsi</w:t>
       </w:r>
     </w:p>
     <w:p>

</xml_diff>